<commit_message>
Stipend application: Asiacrypt-only narrative, team representative wording, registration-fee support request
Co-Authored-By: Claude Fable 5.1 <noreply@anthropic.com>
</commit_message>
<xml_diff>
--- a/cv/asiacrypt2026/Asiacrypt2026_Stipend_Application_JaehoJeon.docx
+++ b/cv/asiacrypt2026/Asiacrypt2026_Stipend_Application_JaehoJeon.docx
@@ -1749,7 +1749,7 @@
           <w:sz w:val="19"/>
           <w:szCs w:val="19"/>
         </w:rPr>
-        <w:t xml:space="preserve"> (first author), accepted to Asiacrypt 2026</w:t>
+        <w:t xml:space="preserve"> (presenting author), accepted to Asiacrypt 2026</w:t>
       </w:r>
     </w:p>
     <w:p>
@@ -1820,7 +1820,7 @@
           <w:sz w:val="21"/>
           <w:szCs w:val="21"/>
         </w:rPr>
-        <w:t xml:space="preserve">, in particular code-based schemes: our Asiacrypt 2026 paper shows that codeword masking, a widely used countermeasure in HQC implementations, can actually be harmful under replay attacks, and analyzes the conditions under which it reduces rather than improves security. I have also worked on PQC implementations on constrained devices (ARM Cortex-M4), and on coding-theoretic tools for robustness, which led to a paper accepted to NeurIPS 2026.</w:t>
+        <w:t xml:space="preserve">, in particular code-based schemes: our Asiacrypt 2026 paper shows that codeword masking, a widely used countermeasure in HQC implementations, can actually be harmful under replay attacks, and analyzes the conditions under which it reduces rather than improves security.</w:t>
       </w:r>
     </w:p>
     <w:p>
@@ -1866,7 +1866,7 @@
           <w:sz w:val="21"/>
           <w:szCs w:val="21"/>
         </w:rPr>
-        <w:t xml:space="preserve">Asiacrypt 2026 will be my first time presenting at an IACR flagship conference. I am a first-year Ph.D. student, and this paper is the first work I have led from the initial observation to the final analysis. Presenting it in person to the researchers who design, implement, and attack code-based schemes is the most direct way to test our claims, to learn which assumptions the community finds convincing, and to understand which follow-up questions matter most. Since HQC was selected by NIST for standardization, the question of which countermeasures are safe to deploy has become urgent, and I expect the discussions around our result to shape the next steps of my thesis.</w:t>
+        <w:t xml:space="preserve">Asiacrypt 2026 will be my first time presenting at an IACR flagship conference. I am a first-year Ph.D. student, and I will present this paper on behalf of our team. Presenting it in person to the researchers who design, implement, and attack code-based schemes is the most direct way to test our claims, to learn which assumptions the community finds convincing, and to understand which follow-up questions matter most. Since HQC was selected by NIST for standardization, the question of which countermeasures are safe to deploy has become urgent, and I expect the discussions around our result to shape the next steps of my thesis.</w:t>
       </w:r>
     </w:p>
     <w:p>
@@ -1881,7 +1881,7 @@
           <w:sz w:val="21"/>
           <w:szCs w:val="21"/>
         </w:rPr>
-        <w:t xml:space="preserve">Beyond my own talk, Asiacrypt is where the PQC, implementation-security, and side-channel communities meet. My lab is relatively small and geographically distant from most of these groups, so a few days of conversations at the conference are worth months of reading papers alone. I also mentor undergraduate research teams at DGIST and help organize our lab's cryptography summer camp, so what I learn at Asiacrypt will be passed on to students deciding whether to pursue cryptography.</w:t>
+        <w:t xml:space="preserve">Beyond my own talk, Asiacrypt is where the PQC, implementation-security, and side-channel communities meet. My lab is relatively small and geographically distant from most of these groups, so a few days of conversations at the conference are worth months of reading papers alone. What I learn at Asiacrypt will also be shared with the other members of my laboratory.</w:t>
       </w:r>
     </w:p>
     <w:p>
@@ -2130,7 +2130,7 @@
           <w:sz w:val="21"/>
           <w:szCs w:val="21"/>
         </w:rPr>
-        <w:t xml:space="preserve"> at Asiacrypt 2026 as its first author.</w:t>
+        <w:t xml:space="preserve"> at Asiacrypt 2026 on behalf of our team.</w:t>
       </w:r>
     </w:p>
     <w:p>
@@ -2145,7 +2145,7 @@
           <w:sz w:val="21"/>
           <w:szCs w:val="21"/>
         </w:rPr>
-        <w:t xml:space="preserve">Jaeho joined my laboratory as a master's student in 2024 and began his Ph.D. in February 2026. He works on side-channel analysis and the implementation security of post-quantum cryptography. The Asiacrypt paper is his own initiative: he noticed that a standard countermeasure for HQC behaves unexpectedly under replay attacks, developed the analysis, and carried the work through to acceptance. He is also a co-author of a paper accepted to NeurIPS 2026 and received the Grand Prize of the 4th KICS HFR Paper Award in 2026. In addition to research, he mentors undergraduate research teams, one of which won two national-level awards for a PQC implementation on ARM Cortex-M4 under his guidance, and he organized our lab's AI &amp; Crypto Summer Camp this year. He is exactly the kind of early-career researcher who benefits most from presenting at, and meeting the community of, an IACR conference.</w:t>
+        <w:t xml:space="preserve">Jaeho joined my laboratory as a master's student in 2024 and began his Ph.D. in February 2026. He works on side-channel analysis and the implementation security of post-quantum cryptography. The Asiacrypt paper, which shows that codeword masking, a common countermeasure for HQC, can be harmful under replay attacks, is a joint work of our laboratory, and Jaeho will present it at the conference as the representative of the team. He is exactly the kind of early-career researcher who benefits most from presenting at, and meeting the community of, an IACR conference.</w:t>
       </w:r>
     </w:p>
     <w:p>
@@ -2171,7 +2171,7 @@
           <w:sz w:val="21"/>
           <w:szCs w:val="21"/>
         </w:rPr>
-        <w:t xml:space="preserve">Jaeho has applied for the student presenter registration fee waiver. For his travel and accommodation in Hong Kong, the laboratory will contribute up to USD 100; no further institutional travel funding is available for this trip. I would appreciate the committee's support for the remaining cost.</w:t>
+        <w:t xml:space="preserve">The laboratory will cover Jaeho's travel expenses for Asiacrypt 2026 in Hong Kong, including airfare and accommodation. However, we do not have funding available for the conference registration fee, and I would appreciate the committee's support for the registration cost.</w:t>
       </w:r>
     </w:p>
     <w:p>

</xml_diff>